<commit_message>
Prayer guide 2026-10-07: 10 points
Co-Authored-By: Claude Sonnet 5.5 <noreply@anthropic.com>
Claude-Session: https://claude.ai/code/session_01H4u8HYcJY6Sxmf9Sb5YhtJ
</commit_message>
<xml_diff>
--- a/prayer/2026-10-07.docx
+++ b/prayer/2026-10-07.docx
@@ -79,10 +79,10 @@
           <w:b/>
           <w:bCs/>
         </w:rPr>
-        <w:t xml:space="preserve">Passengers and crew of the FlyDubai flight, and travellers' safety</w:t>
-      </w:r>
-      <w:r>
-        <w:t xml:space="preserve"> — Psalm 91:1-2</w:t>
+        <w:t xml:space="preserve">Passengers and crews saved from the flydubai attack</w:t>
+      </w:r>
+      <w:r>
+        <w:t xml:space="preserve"> — Psalm 124:7-8</w:t>
       </w:r>
     </w:p>
     <w:p>
@@ -105,10 +105,10 @@
           <w:b/>
           <w:bCs/>
         </w:rPr>
-        <w:t xml:space="preserve">Israel's election, its courts and its leaders</w:t>
-      </w:r>
-      <w:r>
-        <w:t xml:space="preserve"> — Proverbs 21:1</w:t>
+        <w:t xml:space="preserve">Wisdom for leaders and voters in Israel's election</w:t>
+      </w:r>
+      <w:r>
+        <w:t xml:space="preserve"> — James 1:5</w:t>
       </w:r>
     </w:p>
     <w:p>
@@ -131,10 +131,10 @@
           <w:b/>
           <w:bCs/>
         </w:rPr>
-        <w:t xml:space="preserve">Peace in Judea and Samaria: villagers, farmers and those who live there</w:t>
-      </w:r>
-      <w:r>
-        <w:t xml:space="preserve"> — Romans 12:21</w:t>
+        <w:t xml:space="preserve">Peace and safety in Judea and Samaria</w:t>
+      </w:r>
+      <w:r>
+        <w:t xml:space="preserve"> — Psalm 85:10-11</w:t>
       </w:r>
     </w:p>
     <w:p>
@@ -157,7 +157,85 @@
           <w:b/>
           <w:bCs/>
         </w:rPr>
-        <w:t xml:space="preserve">Jewish communities targeted by hatred: Belleville and Manchester</w:t>
+        <w:t xml:space="preserve">Jewish communities facing threats in Britain and Canada</w:t>
+      </w:r>
+      <w:r>
+        <w:t xml:space="preserve"> — Deuteronomy 31:6</w:t>
+      </w:r>
+    </w:p>
+    <w:p>
+      <w:pPr>
+        <w:pStyle w:val="Glance"/>
+      </w:pPr>
+      <w:r>
+        <w:rPr>
+          <w:b/>
+          <w:bCs/>
+          <w:color w:val="0038B8"/>
+        </w:rPr>
+        <w:t xml:space="preserve">5.</w:t>
+      </w:r>
+      <w:r>
+        <w:tab/>
+      </w:r>
+      <w:r>
+        <w:rPr>
+          <w:b/>
+          <w:bCs/>
+        </w:rPr>
+        <w:t xml:space="preserve">The bereaved three years after 7 October</w:t>
+      </w:r>
+      <w:r>
+        <w:t xml:space="preserve"> — 2 Corinthians 1:3-4</w:t>
+      </w:r>
+    </w:p>
+    <w:p>
+      <w:pPr>
+        <w:pStyle w:val="Glance"/>
+      </w:pPr>
+      <w:r>
+        <w:rPr>
+          <w:b/>
+          <w:bCs/>
+          <w:color w:val="0038B8"/>
+        </w:rPr>
+        <w:t xml:space="preserve">6.</w:t>
+      </w:r>
+      <w:r>
+        <w:tab/>
+      </w:r>
+      <w:r>
+        <w:rPr>
+          <w:b/>
+          <w:bCs/>
+        </w:rPr>
+        <w:t xml:space="preserve">The LORD round about His people</w:t>
+      </w:r>
+      <w:r>
+        <w:t xml:space="preserve"> — Psalm 125:2</w:t>
+      </w:r>
+    </w:p>
+    <w:p>
+      <w:pPr>
+        <w:pStyle w:val="Glance"/>
+      </w:pPr>
+      <w:r>
+        <w:rPr>
+          <w:b/>
+          <w:bCs/>
+          <w:color w:val="0038B8"/>
+        </w:rPr>
+        <w:t xml:space="preserve">7.</w:t>
+      </w:r>
+      <w:r>
+        <w:tab/>
+      </w:r>
+      <w:r>
+        <w:rPr>
+          <w:b/>
+          <w:bCs/>
+        </w:rPr>
+        <w:t xml:space="preserve">The Lord is faithful and keeps from evil</w:t>
       </w:r>
       <w:r>
         <w:t xml:space="preserve"> — 2 Thessalonians 3:3</w:t>
@@ -173,7 +251,7 @@
           <w:bCs/>
           <w:color w:val="0038B8"/>
         </w:rPr>
-        <w:t xml:space="preserve">5.</w:t>
+        <w:t xml:space="preserve">8.</w:t>
       </w:r>
       <w:r>
         <w:tab/>
@@ -183,10 +261,10 @@
           <w:b/>
           <w:bCs/>
         </w:rPr>
-        <w:t xml:space="preserve">The bereaved and wounded three years after 7 October</w:t>
-      </w:r>
-      <w:r>
-        <w:t xml:space="preserve"> — Psalm 147:3</w:t>
+        <w:t xml:space="preserve">The LORD of hosts defends Jerusalem</w:t>
+      </w:r>
+      <w:r>
+        <w:t xml:space="preserve"> — Isaiah 31:5</w:t>
       </w:r>
     </w:p>
     <w:p>
@@ -199,7 +277,7 @@
           <w:bCs/>
           <w:color w:val="0038B8"/>
         </w:rPr>
-        <w:t xml:space="preserve">6.</w:t>
+        <w:t xml:space="preserve">9.</w:t>
       </w:r>
       <w:r>
         <w:tab/>
@@ -209,10 +287,10 @@
           <w:b/>
           <w:bCs/>
         </w:rPr>
-        <w:t xml:space="preserve">The LORD around His people as the mountains are around Jerusalem</w:t>
-      </w:r>
-      <w:r>
-        <w:t xml:space="preserve"> — Psalm 125:2</w:t>
+        <w:t xml:space="preserve">The Lord laid on Him the iniquity of us all</w:t>
+      </w:r>
+      <w:r>
+        <w:t xml:space="preserve"> — Isaiah 53:5-6</w:t>
       </w:r>
     </w:p>
     <w:p>
@@ -225,7 +303,7 @@
           <w:bCs/>
           <w:color w:val="0038B8"/>
         </w:rPr>
-        <w:t xml:space="preserve">7.</w:t>
+        <w:t xml:space="preserve">10.</w:t>
       </w:r>
       <w:r>
         <w:tab/>
@@ -235,88 +313,10 @@
           <w:b/>
           <w:bCs/>
         </w:rPr>
-        <w:t xml:space="preserve">God's care for the apple of His eye</w:t>
-      </w:r>
-      <w:r>
-        <w:t xml:space="preserve"> — Zechariah 2:8</w:t>
-      </w:r>
-    </w:p>
-    <w:p>
-      <w:pPr>
-        <w:pStyle w:val="Glance"/>
-      </w:pPr>
-      <w:r>
-        <w:rPr>
-          <w:b/>
-          <w:bCs/>
-          <w:color w:val="0038B8"/>
-        </w:rPr>
-        <w:t xml:space="preserve">8.</w:t>
-      </w:r>
-      <w:r>
-        <w:tab/>
-      </w:r>
-      <w:r>
-        <w:rPr>
-          <w:b/>
-          <w:bCs/>
-        </w:rPr>
-        <w:t xml:space="preserve">No one can pluck them from the Shepherd's hand</w:t>
-      </w:r>
-      <w:r>
-        <w:t xml:space="preserve"> — John 10:28</w:t>
-      </w:r>
-    </w:p>
-    <w:p>
-      <w:pPr>
-        <w:pStyle w:val="Glance"/>
-      </w:pPr>
-      <w:r>
-        <w:rPr>
-          <w:b/>
-          <w:bCs/>
-          <w:color w:val="0038B8"/>
-        </w:rPr>
-        <w:t xml:space="preserve">9.</w:t>
-      </w:r>
-      <w:r>
-        <w:tab/>
-      </w:r>
-      <w:r>
-        <w:rPr>
-          <w:b/>
-          <w:bCs/>
-        </w:rPr>
-        <w:t xml:space="preserve">A law written on the heart: the new covenant with the house of Israel</w:t>
-      </w:r>
-      <w:r>
-        <w:t xml:space="preserve"> — Jeremiah 31:33</w:t>
-      </w:r>
-    </w:p>
-    <w:p>
-      <w:pPr>
-        <w:pStyle w:val="Glance"/>
-      </w:pPr>
-      <w:r>
-        <w:rPr>
-          <w:b/>
-          <w:bCs/>
-          <w:color w:val="0038B8"/>
-        </w:rPr>
-        <w:t xml:space="preserve">10.</w:t>
-      </w:r>
-      <w:r>
-        <w:tab/>
-      </w:r>
-      <w:r>
-        <w:rPr>
-          <w:b/>
-          <w:bCs/>
-        </w:rPr>
-        <w:t xml:space="preserve">The way, the truth and the life</w:t>
-      </w:r>
-      <w:r>
-        <w:t xml:space="preserve"> — John 14:6</w:t>
+        <w:t xml:space="preserve">No other name under heaven</w:t>
+      </w:r>
+      <w:r>
+        <w:t xml:space="preserve"> — Acts 4:12</w:t>
       </w:r>
     </w:p>
     <w:p>
@@ -332,7 +332,7 @@
         <w:pStyle w:val="Heading2"/>
       </w:pPr>
       <w:r>
-        <w:t xml:space="preserve">1. Passengers and crew of the FlyDubai flight, and travellers' safety</w:t>
+        <w:t xml:space="preserve">1. Passengers and crews saved from the flydubai attack</w:t>
       </w:r>
     </w:p>
     <w:p>
@@ -366,10 +366,10 @@
           <w:iCs w:val="0"/>
           <w:vertAlign w:val="superscript"/>
         </w:rPr>
-        <w:t xml:space="preserve">1</w:t>
-      </w:r>
-      <w:r>
-        <w:t xml:space="preserve"> He that dwelleth in the secret place of the most High shall abide under the shadow of the Almighty. </w:t>
+        <w:t xml:space="preserve">7</w:t>
+      </w:r>
+      <w:r>
+        <w:t xml:space="preserve"> Our soul is escaped as a bird out of the snare of the fowlers: the snare is broken, and we are escaped. </w:t>
       </w:r>
       <w:r>
         <w:rPr>
@@ -378,10 +378,10 @@
           <w:iCs w:val="0"/>
           <w:vertAlign w:val="superscript"/>
         </w:rPr>
-        <w:t xml:space="preserve">2</w:t>
-      </w:r>
-      <w:r>
-        <w:t xml:space="preserve"> I will say of the LORD, He is my refuge and my fortress: my God; in him will I trust. </w:t>
+        <w:t xml:space="preserve">8</w:t>
+      </w:r>
+      <w:r>
+        <w:t xml:space="preserve"> Our help is in the name of the LORD, who made heaven and earth. </w:t>
       </w:r>
     </w:p>
     <w:p>
@@ -389,7 +389,7 @@
         <w:pStyle w:val="ScriptureRef"/>
       </w:pPr>
       <w:r>
-        <w:t xml:space="preserve">— Psalm 91:1-2  ·  KJV  ·  Old Testament</w:t>
+        <w:t xml:space="preserve">— Psalm 124:7-8  ·  KJV  ·  Old Testament</w:t>
       </w:r>
     </w:p>
     <w:p>
@@ -405,7 +405,7 @@
         <w:t xml:space="preserve">Prayer: </w:t>
       </w:r>
       <w:r>
-        <w:t xml:space="preserve">Lord Jesus, I thank You for the passengers who rushed in and the pilot who helped land the FlyDubai aircraft, and I ask You to heal the fear and shock in everyone who was on board, including the Israelis aboard. Your word speaks of the secret place of the Most High and of a refuge and a fortress. Be that refuge to them and to every traveller. Expose and hinder those who plan violence from the air, give investigators truthful answers, and guard the innocent. Let those who trembled find that they can trust in You. Amen.</w:t>
+        <w:t xml:space="preserve">Lord Jesus, I thank You for the passengers who stopped the attack on that flight, and for the captain who survived. Like a bird out of the snare of the fowlers, they escaped, and I give You the praise. Our help is in the name of the LORD. I ask You to heal the shaken, to give peace to every family who flew in fear, and to guard the skies over Israel and every traveller. Expose and break every plan of hatred before it is carried out, and keep Your people safe in the air and on the ground. Turn the heart of anyone drawn toward violence, and let Your mercy reach even them. Amen.</w:t>
       </w:r>
     </w:p>
     <w:p>
@@ -413,7 +413,7 @@
         <w:pStyle w:val="Heading2"/>
       </w:pPr>
       <w:r>
-        <w:t xml:space="preserve">2. Israel's election, its courts and its leaders</w:t>
+        <w:t xml:space="preserve">2. Wisdom for leaders and voters in Israel's election</w:t>
       </w:r>
     </w:p>
     <w:p>
@@ -441,7 +441,7 @@
         <w:pStyle w:val="Scripture"/>
       </w:pPr>
       <w:r>
-        <w:t xml:space="preserve">The king’s heart is in the hand of the LORD, as the rivers of water: he turneth it whithersoever he will.</w:t>
+        <w:t xml:space="preserve">If any of you lack wisdom, let him ask of God, that giveth to all men liberally, and upbraideth not; and it shall be given him.</w:t>
       </w:r>
     </w:p>
     <w:p>
@@ -449,7 +449,7 @@
         <w:pStyle w:val="ScriptureRef"/>
       </w:pPr>
       <w:r>
-        <w:t xml:space="preserve">— Proverbs 21:1  ·  KJV  ·  Old Testament</w:t>
+        <w:t xml:space="preserve">— James 1:5  ·  KJV  ·  New Testament</w:t>
       </w:r>
     </w:p>
     <w:p>
@@ -465,7 +465,7 @@
         <w:t xml:space="preserve">Prayer: </w:t>
       </w:r>
       <w:r>
-        <w:t xml:space="preserve">Lord Jesus, I lift to You Israel's election on 27 October, the 38 lists seeking votes, the judges who ruled on who may stand, and every leader and voter. Your word says the king's heart is in the hand of the LORD. Turn the hearts of those in authority toward justice, truth and the protection of life. Give wisdom to the Central Elections Committee and the courts, calm to a divided public, and a fair and safe vote for Jewish and Arab citizens alike. Let no decision be made from fear or pride, and draw this nation toward You. Amen.</w:t>
+        <w:t xml:space="preserve">Lord Jesus, Israel goes to the polls on 27 October, and the court has just ruled on which parties may stand. I ask for the wisdom that You give liberally and without reproach. Give every leader, judge, candidate and voter a clear mind and a clean heart. Let justice be done and fairness be seen, for Jewish and Arab citizens alike. Quiet the bitterness of the campaign, guard the vote from violence and deceit, and let the outcome serve peace and the good of all who live in the land. I ask in Your name, trusting that You hear when I ask. Amen.</w:t>
       </w:r>
     </w:p>
     <w:p>
@@ -473,7 +473,7 @@
         <w:pStyle w:val="Heading2"/>
       </w:pPr>
       <w:r>
-        <w:t xml:space="preserve">3. Peace in Judea and Samaria: villagers, farmers and those who live there</w:t>
+        <w:t xml:space="preserve">3. Peace and safety in Judea and Samaria</w:t>
       </w:r>
     </w:p>
     <w:p>
@@ -501,7 +501,28 @@
         <w:pStyle w:val="Scripture"/>
       </w:pPr>
       <w:r>
-        <w:t xml:space="preserve">Be not overcome of evil, but overcome evil with good.</w:t>
+        <w:rPr>
+          <w:color w:val="0038B8"/>
+          <w:i w:val="0"/>
+          <w:iCs w:val="0"/>
+          <w:vertAlign w:val="superscript"/>
+        </w:rPr>
+        <w:t xml:space="preserve">10</w:t>
+      </w:r>
+      <w:r>
+        <w:t xml:space="preserve"> Mercy and truth are met together; righteousness and peace have kissed each other. </w:t>
+      </w:r>
+      <w:r>
+        <w:rPr>
+          <w:color w:val="0038B8"/>
+          <w:i w:val="0"/>
+          <w:iCs w:val="0"/>
+          <w:vertAlign w:val="superscript"/>
+        </w:rPr>
+        <w:t xml:space="preserve">11</w:t>
+      </w:r>
+      <w:r>
+        <w:t xml:space="preserve"> Truth shall spring out of the earth; and righteousness shall look down from heaven. </w:t>
       </w:r>
     </w:p>
     <w:p>
@@ -509,7 +530,7 @@
         <w:pStyle w:val="ScriptureRef"/>
       </w:pPr>
       <w:r>
-        <w:t xml:space="preserve">— Romans 12:21  ·  KJV  ·  New Testament</w:t>
+        <w:t xml:space="preserve">— Psalm 85:10-11  ·  KJV  ·  Old Testament</w:t>
       </w:r>
     </w:p>
     <w:p>
@@ -525,7 +546,7 @@
         <w:t xml:space="preserve">Prayer: </w:t>
       </w:r>
       <w:r>
-        <w:t xml:space="preserve">Lord Jesus, I bring to You the families near Hebron, Aqraba and Jerusalem whose homes, vehicles and animals were reported burned, and the wounded olive pickers. I also pray for Jewish and Palestinian neighbours in Judea and Samaria who want to live in peace. Your word says to be not overcome of evil, but overcome evil with good. Protect the vulnerable, restrain anyone who would commit violence, and give soldiers, police and courts the courage to uphold justice. Soften hard hearts, comfort the afraid, and let Your peace take root in this land. Amen.</w:t>
+        <w:t xml:space="preserve">Lord Jesus, You see the stabbing attempt near Hananya Farm and the reports of homes and vehicles burned near Hebron and Aqraba. I pray for the wounded on every side, and for every family afraid in the night. Let mercy and truth meet together in Judea and Samaria, and righteousness and peace kiss each other. Restrain those who plan violence, whoever they are. Give soldiers and police wisdom and self-control, give farmers a safe olive harvest, and bring justice to those who suffered wrong. Prince of Peace, be near to Israelis and Palestinians who long to live without fear. Amen.</w:t>
       </w:r>
     </w:p>
     <w:p>
@@ -533,7 +554,7 @@
         <w:pStyle w:val="Heading2"/>
       </w:pPr>
       <w:r>
-        <w:t xml:space="preserve">4. Jewish communities targeted by hatred: Belleville and Manchester</w:t>
+        <w:t xml:space="preserve">4. Jewish communities facing threats in Britain and Canada</w:t>
       </w:r>
     </w:p>
     <w:p>
@@ -572,7 +593,7 @@
         <w:pStyle w:val="Scripture"/>
       </w:pPr>
       <w:r>
-        <w:t xml:space="preserve">But the Lord is faithful, who shall stablish you, and keep you from evil.</w:t>
+        <w:t xml:space="preserve">Be strong and of a good courage, fear not, nor be afraid of them: for the LORD thy God, he it is that doth go with thee; he will not fail thee, nor forsake thee.</w:t>
       </w:r>
     </w:p>
     <w:p>
@@ -580,7 +601,7 @@
         <w:pStyle w:val="ScriptureRef"/>
       </w:pPr>
       <w:r>
-        <w:t xml:space="preserve">— 2 Thessalonians 3:3  ·  KJV  ·  New Testament</w:t>
+        <w:t xml:space="preserve">— Deuteronomy 31:6  ·  KJV  ·  Old Testament</w:t>
       </w:r>
     </w:p>
     <w:p>
@@ -596,7 +617,7 @@
         <w:t xml:space="preserve">Prayer: </w:t>
       </w:r>
       <w:r>
-        <w:t xml:space="preserve">Lord Jesus, I pray for the congregation in Belleville, Ontario, who found hateful flyers while still grieving a Yom Kippur attack, and for Manchester's Jewish community, where two men are charged over an alleged plot. Your word says the Lord is faithful, who shall stablish you, and keep you from evil. Keep these families safe, strengthen the guards and police who watch over them, and let courts act with justice. Comfort the traumatised, give their neighbours courage to stand beside them, and turn those who hate toward repentance and Your love. Amen.</w:t>
+        <w:t xml:space="preserve">Lord Jesus, I lift up the Jewish community of Belleville, Ontario, who found hateful flyers at their synagogue, and the Jews of Manchester, where two men are charged over an alleged plot. Be strong for those who feel weak. Let them hear Your word, fear not, for the LORD goes with them and will not fail or forsake them. Protect every synagogue, school and family during these days around 7 October. Give police and neighbours the will to stand beside them, and let the hatred that spreads in dark places be exposed to light. Comfort the frightened and keep them close to You. Amen.</w:t>
       </w:r>
     </w:p>
     <w:p>
@@ -604,7 +625,7 @@
         <w:pStyle w:val="Heading2"/>
       </w:pPr>
       <w:r>
-        <w:t xml:space="preserve">5. The bereaved and wounded three years after 7 October</w:t>
+        <w:t xml:space="preserve">5. The bereaved three years after 7 October</w:t>
       </w:r>
     </w:p>
     <w:p>
@@ -626,13 +647,45 @@
           <w:t xml:space="preserve">Israelis mark three years since the 7 October attack</w:t>
         </w:r>
       </w:hyperlink>
+      <w:r>
+        <w:t xml:space="preserve">; </w:t>
+      </w:r>
+      <w:hyperlink r:id="rIdL8" w:history="1">
+        <w:r>
+          <w:rPr>
+            <w:rStyle w:val="Hyperlink"/>
+          </w:rPr>
+          <w:t xml:space="preserve">British Jewry to hold 7 October vigil</w:t>
+        </w:r>
+      </w:hyperlink>
     </w:p>
     <w:p>
       <w:pPr>
         <w:pStyle w:val="Scripture"/>
       </w:pPr>
       <w:r>
-        <w:t xml:space="preserve">He healeth the broken in heart, and bindeth up their wounds.</w:t>
+        <w:rPr>
+          <w:color w:val="0038B8"/>
+          <w:i w:val="0"/>
+          <w:iCs w:val="0"/>
+          <w:vertAlign w:val="superscript"/>
+        </w:rPr>
+        <w:t xml:space="preserve">3</w:t>
+      </w:r>
+      <w:r>
+        <w:t xml:space="preserve"> Blessed be God, even the Father of our Lord Jesus Christ, the Father of mercies, and the God of all comfort; </w:t>
+      </w:r>
+      <w:r>
+        <w:rPr>
+          <w:color w:val="0038B8"/>
+          <w:i w:val="0"/>
+          <w:iCs w:val="0"/>
+          <w:vertAlign w:val="superscript"/>
+        </w:rPr>
+        <w:t xml:space="preserve">4</w:t>
+      </w:r>
+      <w:r>
+        <w:t xml:space="preserve"> Who comforteth us in all our tribulation, that we may be able to comfort them which are in any trouble, by the comfort wherewith we ourselves are comforted of God. </w:t>
       </w:r>
     </w:p>
     <w:p>
@@ -640,7 +693,7 @@
         <w:pStyle w:val="ScriptureRef"/>
       </w:pPr>
       <w:r>
-        <w:t xml:space="preserve">— Psalm 147:3  ·  KJV  ·  Old Testament</w:t>
+        <w:t xml:space="preserve">— 2 Corinthians 1:3-4  ·  KJV  ·  New Testament</w:t>
       </w:r>
     </w:p>
     <w:p>
@@ -656,7 +709,7 @@
         <w:t xml:space="preserve">Prayer: </w:t>
       </w:r>
       <w:r>
-        <w:t xml:space="preserve">Lord Jesus, three years after 7 October I bring You the families who still mourn, the wounded in body and mind, the soldiers who carry what they saw, and the many in Gaza and Lebanon who have lost loved ones in this war. Your word says He healeth the broken in heart, and bindeth up their wounds. Bind up what time has not healed. Sit with those for whom the commemorations reopen grief, give rest to the sleepless, and send comforters to every home with an empty chair. Bring true and lasting peace. Amen.</w:t>
+        <w:t xml:space="preserve">Lord Jesus, three years on, I remember the families who still grieve those murdered on 7 October, the survivors who carry what they saw, and the soldiers and hostages' families who live with loss. You are the Father of mercies and the God of all comfort, and I ask You to come to each one in their tribulation. Sit with them at the memorials in Israel and at the vigil in London. Comfort them so that they may comfort others. Give sleep to the sleepless, and hope to those who have none. Remember also the innocent in Gaza who mourn, and draw near to them. Amen.</w:t>
       </w:r>
     </w:p>
     <w:p>
@@ -672,7 +725,7 @@
         <w:pStyle w:val="Heading2"/>
       </w:pPr>
       <w:r>
-        <w:t xml:space="preserve">6. The LORD around His people as the mountains are around Jerusalem</w:t>
+        <w:t xml:space="preserve">6. The LORD round about His people</w:t>
       </w:r>
     </w:p>
     <w:p>
@@ -704,7 +757,7 @@
         <w:t xml:space="preserve">Prayer: </w:t>
       </w:r>
       <w:r>
-        <w:t xml:space="preserve">Lord Jesus, I ask You to surround Jerusalem and the whole nation of Israel with Your protection, as the mountains stand around the city. Guard her towns from missiles, drones and attacks, her soldiers and civilians in danger on every border, and her people in the shelters at night. Give her leaders wisdom, her defenders courage and restraint, and her children rest. Let Israel know that You are round about her, now and for ever, and bring the peace that only You can give. Amen.</w:t>
+        <w:t xml:space="preserve">Lord Jesus, as the mountains are round about Jerusalem, so I ask You to be round about Your people, now and for ever. The National Security Council has warned of heightened danger around this anniversary, and Hezbollah, Hamas and Iran continue to threaten. Surround the cities, towns and borders of Israel, and every soldier and civilian who stands in harm's way. Let no attack succeed, and give the nation's defenders discernment and restraint. Be a wall of peace for families in the north, the south, the cities and the hills, and let them sleep without fear. Amen.</w:t>
       </w:r>
     </w:p>
     <w:p>
@@ -712,7 +765,7 @@
         <w:pStyle w:val="Heading2"/>
       </w:pPr>
       <w:r>
-        <w:t xml:space="preserve">7. God's care for the apple of His eye</w:t>
+        <w:t xml:space="preserve">7. The Lord is faithful and keeps from evil</w:t>
       </w:r>
     </w:p>
     <w:p>
@@ -720,7 +773,7 @@
         <w:pStyle w:val="Scripture"/>
       </w:pPr>
       <w:r>
-        <w:t xml:space="preserve">For thus saith the LORD of hosts; After the glory hath he sent me unto the nations which spoiled you: for he that toucheth you toucheth the apple of his eye.</w:t>
+        <w:t xml:space="preserve">But the Lord is faithful, who shall stablish you, and keep you from evil.</w:t>
       </w:r>
     </w:p>
     <w:p>
@@ -728,7 +781,7 @@
         <w:pStyle w:val="ScriptureRef"/>
       </w:pPr>
       <w:r>
-        <w:t xml:space="preserve">— Zechariah 2:8  ·  KJV  ·  Old Testament</w:t>
+        <w:t xml:space="preserve">— 2 Thessalonians 3:3  ·  KJV  ·  New Testament</w:t>
       </w:r>
     </w:p>
     <w:p>
@@ -744,7 +797,7 @@
         <w:t xml:space="preserve">Prayer: </w:t>
       </w:r>
       <w:r>
-        <w:t xml:space="preserve">Lord Jesus, You are the LORD of hosts who spoke of Your people as the apple of Your eye. I ask You to shield Jewish people everywhere, in Israel, Europe, the Americas, Africa and every city where they live, from those who would harm them. Frustrate violent plots, protect synagogues, schools and families, and lead nations to defend their Jewish citizens. Fill Your people with courage and let Your faithfulness toward them be seen. Amen.</w:t>
+        <w:t xml:space="preserve">Lord Jesus, You are faithful, and You stablish and keep Your people from evil. I pray this for Jewish families in every nation who are watching the news with fear this week. Keep them from the violent, and keep their hearts from despair and bitterness. Strengthen those who guard synagogues and community centres, and those who travel, study and work as Jews in places where it is hard. Let them know You are faithful, today and every day, and surprise them with kindness from their neighbours. Amen.</w:t>
       </w:r>
     </w:p>
     <w:p>
@@ -752,7 +805,7 @@
         <w:pStyle w:val="Heading2"/>
       </w:pPr>
       <w:r>
-        <w:t xml:space="preserve">8. No one can pluck them from the Shepherd's hand</w:t>
+        <w:t xml:space="preserve">8. The LORD of hosts defends Jerusalem</w:t>
       </w:r>
     </w:p>
     <w:p>
@@ -760,7 +813,7 @@
         <w:pStyle w:val="Scripture"/>
       </w:pPr>
       <w:r>
-        <w:t xml:space="preserve">And I give unto them eternal life; and they shall never perish, neither shall any man pluck them out of my hand.</w:t>
+        <w:t xml:space="preserve">As birds flying, so will the LORD of hosts defend Jerusalem; defending also he will deliver it; and passing over he will preserve it.</w:t>
       </w:r>
     </w:p>
     <w:p>
@@ -768,7 +821,7 @@
         <w:pStyle w:val="ScriptureRef"/>
       </w:pPr>
       <w:r>
-        <w:t xml:space="preserve">— John 10:28  ·  KJV  ·  New Testament</w:t>
+        <w:t xml:space="preserve">— Isaiah 31:5  ·  KJV  ·  Old Testament</w:t>
       </w:r>
     </w:p>
     <w:p>
@@ -784,7 +837,7 @@
         <w:t xml:space="preserve">Prayer: </w:t>
       </w:r>
       <w:r>
-        <w:t xml:space="preserve">Lord Jesus, You are the Good Shepherd, and You said that none shall pluck Your sheep out of Your hand. I ask You to hold close every Jewish family tonight, those in fear, those in grief and those in danger. Be their security when the world around them is shaken. Keep Your promise to Your people, preserve them through every trial, and let them one day know the safety of Your hand. Watch over those who serve in the Israeli army, and bring them home safely. Amen.</w:t>
+        <w:t xml:space="preserve">Lord Jesus, You promised that as birds flying, so the LORD of hosts will defend Jerusalem, defending, delivering, and passing over to preserve it. I hold You to the love in that promise and ask You to guard Jerusalem and every city of Israel. Preserve its children, its elderly, its sick and its visitors. Overrule the plans of those who wish it harm, and keep Your people from every sudden terror. Let Jerusalem be a city of peace, and let Your name be honoured in it. Amen.</w:t>
       </w:r>
     </w:p>
     <w:p>
@@ -800,7 +853,7 @@
         <w:pStyle w:val="Heading2"/>
       </w:pPr>
       <w:r>
-        <w:t xml:space="preserve">9. A law written on the heart: the new covenant with the house of Israel</w:t>
+        <w:t xml:space="preserve">9. The Lord laid on Him the iniquity of us all</w:t>
       </w:r>
     </w:p>
     <w:p>
@@ -808,7 +861,28 @@
         <w:pStyle w:val="Scripture"/>
       </w:pPr>
       <w:r>
-        <w:t xml:space="preserve">But this shall be the covenant that I will make with the house of Israel; After those days, saith the LORD, I will put my law in their inward parts, and write it in their hearts; and will be their God, and they shall be my people.</w:t>
+        <w:rPr>
+          <w:color w:val="0038B8"/>
+          <w:i w:val="0"/>
+          <w:iCs w:val="0"/>
+          <w:vertAlign w:val="superscript"/>
+        </w:rPr>
+        <w:t xml:space="preserve">5</w:t>
+      </w:r>
+      <w:r>
+        <w:t xml:space="preserve"> But he was wounded for our transgressions, he was bruised for our iniquities: the chastisement of our peace was upon him; and with his stripes we are healed. </w:t>
+      </w:r>
+      <w:r>
+        <w:rPr>
+          <w:color w:val="0038B8"/>
+          <w:i w:val="0"/>
+          <w:iCs w:val="0"/>
+          <w:vertAlign w:val="superscript"/>
+        </w:rPr>
+        <w:t xml:space="preserve">6</w:t>
+      </w:r>
+      <w:r>
+        <w:t xml:space="preserve"> All we like sheep have gone astray; we have turned every one to his own way; and the LORD hath laid on him the iniquity of us all. </w:t>
       </w:r>
     </w:p>
     <w:p>
@@ -816,7 +890,7 @@
         <w:pStyle w:val="ScriptureRef"/>
       </w:pPr>
       <w:r>
-        <w:t xml:space="preserve">— Jeremiah 31:33  ·  KJV  ·  Old Testament</w:t>
+        <w:t xml:space="preserve">— Isaiah 53:5-6  ·  KJV  ·  Old Testament</w:t>
       </w:r>
     </w:p>
     <w:p>
@@ -832,7 +906,7 @@
         <w:t xml:space="preserve">Prayer: </w:t>
       </w:r>
       <w:r>
-        <w:t xml:space="preserve">Lord Jesus, You are the promised mediator of the new covenant that the LORD announced to the house of Israel. I pray with love for my Jewish friends and neighbours, and for all Israel, that You would write Your law in their hearts and be known to them as their God and Messiah. Open the eyes of the secular and the religious, remove every barrier of fear and misunderstanding, and send faithful believers to love them with humility and truth. Fulfil Your promise in Your time. Amen.</w:t>
+        <w:t xml:space="preserve">Lord Jesus, with the love Paul had for his own people, I pray that Jewish people may see You in the words of Isaiah. You were wounded for our transgressions, and by Your stripes we are healed. Open the eyes of those who read this chapter, in Israel and in every nation, and let them recognise their Messiah. Remove every barrier of fear, family pressure and old hurt, including the harm done to Jews in Your name. Draw them gently, and let them find in You forgiveness and peace. Amen.</w:t>
       </w:r>
     </w:p>
     <w:p>
@@ -840,7 +914,7 @@
         <w:pStyle w:val="Heading2"/>
       </w:pPr>
       <w:r>
-        <w:t xml:space="preserve">10. The way, the truth and the life</w:t>
+        <w:t xml:space="preserve">10. No other name under heaven</w:t>
       </w:r>
     </w:p>
     <w:p>
@@ -848,7 +922,7 @@
         <w:pStyle w:val="Scripture"/>
       </w:pPr>
       <w:r>
-        <w:t xml:space="preserve">Jesus saith unto him, I am the way, the truth, and the life: no man cometh unto the Father, but by me.</w:t>
+        <w:t xml:space="preserve">Neither is there salvation in any other: for there is none other name under heaven given among men, whereby we must be saved.</w:t>
       </w:r>
     </w:p>
     <w:p>
@@ -856,7 +930,7 @@
         <w:pStyle w:val="ScriptureRef"/>
       </w:pPr>
       <w:r>
-        <w:t xml:space="preserve">— John 14:6  ·  KJV  ·  New Testament</w:t>
+        <w:t xml:space="preserve">— Acts 4:12  ·  KJV  ·  New Testament</w:t>
       </w:r>
     </w:p>
     <w:p>
@@ -872,7 +946,7 @@
         <w:t xml:space="preserve">Prayer: </w:t>
       </w:r>
       <w:r>
-        <w:t xml:space="preserve">Lord Jesus, You said that You are the way, the truth, and the life. I long with all my heart for Jewish people to come to know You as their Messiah and Lord. Let those who are grieving, afraid or searching meet You through Your Word, a kind believer, a dream or Your Spirit. Remove contempt from every Christian heart, and give me a love like Paul's for his own people. Bring many in Israel and in the diaspora to the Father through You. Amen.</w:t>
+        <w:t xml:space="preserve">Lord Jesus, You alone are the salvation of Israel and of all nations, and there is no other name given among men whereby we must be saved. I pray for Jewish friends, neighbours and strangers who do not yet know You. Send them honest, loving witnesses, give them dreams and questions that lead to You, and bring them to call on Your name and be saved. Let them find in You the promised Messiah and Lord, and let me love them as You do. Amen.</w:t>
       </w:r>
     </w:p>
     <w:p>
@@ -892,7 +966,7 @@
           <w:i/>
           <w:iCs/>
         </w:rPr>
-        <w:t xml:space="preserve">Lord Jesus, I commit Israel, the Jewish people and all the peoples of this land to You. Be the refuge of the frightened, the healer of the broken and the peace of Jerusalem. Defend the innocent, restrain violence, give wisdom to leaders, and draw Your people to Yourself as Messiah and Lord. I trust You with what I cannot fix. Amen.</w:t>
+        <w:t xml:space="preserve">Lord Jesus, I bring all of this to You: Israel, Jews in every land, Judea and Samaria, and every person afraid or grieving today. Hear me for the sake of Your mercy. Keep Your people, comfort the bereaved, give peace to the land, and bring Jewish people to know You as Messiah and Lord. Let Your will be done, and let Your name be loved. Amen.</w:t>
       </w:r>
     </w:p>
     <w:p>

</xml_diff>